<commit_message>
Started with step 6 Risk Analysis and ADRs
</commit_message>
<xml_diff>
--- a/docs/06-risk-analysis-and-adrs/RetailSphere_ADR_Register_v1.0.docx
+++ b/docs/06-risk-analysis-and-adrs/RetailSphere_ADR_Register_v1.0.docx
@@ -87,12 +87,6 @@
         <w:gridCol w:w="3200"/>
       </w:tblGrid>
       <w:tr>
-        <w:tblPrEx>
-          <w:tblCellMar>
-            <w:top w:w="0" w:type="dxa"/>
-            <w:bottom w:w="0" w:type="dxa"/>
-          </w:tblCellMar>
-        </w:tblPrEx>
         <w:tc>
           <w:tcPr>
             <w:tcW w:w="1800" w:type="dxa"/>
@@ -152,12 +146,6 @@
         </w:tc>
       </w:tr>
       <w:tr>
-        <w:tblPrEx>
-          <w:tblCellMar>
-            <w:top w:w="0" w:type="dxa"/>
-            <w:bottom w:w="0" w:type="dxa"/>
-          </w:tblCellMar>
-        </w:tblPrEx>
         <w:tc>
           <w:tcPr>
             <w:tcW w:w="1800" w:type="dxa"/>
@@ -217,12 +205,6 @@
         </w:tc>
       </w:tr>
       <w:tr>
-        <w:tblPrEx>
-          <w:tblCellMar>
-            <w:top w:w="0" w:type="dxa"/>
-            <w:bottom w:w="0" w:type="dxa"/>
-          </w:tblCellMar>
-        </w:tblPrEx>
         <w:tc>
           <w:tcPr>
             <w:tcW w:w="1800" w:type="dxa"/>
@@ -282,12 +264,6 @@
         </w:tc>
       </w:tr>
       <w:tr>
-        <w:tblPrEx>
-          <w:tblCellMar>
-            <w:top w:w="0" w:type="dxa"/>
-            <w:bottom w:w="0" w:type="dxa"/>
-          </w:tblCellMar>
-        </w:tblPrEx>
         <w:tc>
           <w:tcPr>
             <w:tcW w:w="1800" w:type="dxa"/>
@@ -347,12 +323,6 @@
         </w:tc>
       </w:tr>
       <w:tr>
-        <w:tblPrEx>
-          <w:tblCellMar>
-            <w:top w:w="0" w:type="dxa"/>
-            <w:bottom w:w="0" w:type="dxa"/>
-          </w:tblCellMar>
-        </w:tblPrEx>
         <w:tc>
           <w:tcPr>
             <w:tcW w:w="1800" w:type="dxa"/>
@@ -489,12 +459,6 @@
         <w:gridCol w:w="9360"/>
       </w:tblGrid>
       <w:tr>
-        <w:tblPrEx>
-          <w:tblCellMar>
-            <w:top w:w="0" w:type="dxa"/>
-            <w:bottom w:w="0" w:type="dxa"/>
-          </w:tblCellMar>
-        </w:tblPrEx>
         <w:tc>
           <w:tcPr>
             <w:tcW w:w="9360" w:type="dxa"/>
@@ -636,12 +600,6 @@
         <w:gridCol w:w="1500"/>
       </w:tblGrid>
       <w:tr>
-        <w:tblPrEx>
-          <w:tblCellMar>
-            <w:top w:w="0" w:type="dxa"/>
-            <w:bottom w:w="0" w:type="dxa"/>
-          </w:tblCellMar>
-        </w:tblPrEx>
         <w:trPr>
           <w:tblHeader/>
         </w:trPr>
@@ -821,12 +779,6 @@
         </w:tc>
       </w:tr>
       <w:tr>
-        <w:tblPrEx>
-          <w:tblCellMar>
-            <w:top w:w="0" w:type="dxa"/>
-            <w:bottom w:w="0" w:type="dxa"/>
-          </w:tblCellMar>
-        </w:tblPrEx>
         <w:tc>
           <w:tcPr>
             <w:tcW w:w="900" w:type="dxa"/>
@@ -1007,12 +959,6 @@
         </w:tc>
       </w:tr>
       <w:tr>
-        <w:tblPrEx>
-          <w:tblCellMar>
-            <w:top w:w="0" w:type="dxa"/>
-            <w:bottom w:w="0" w:type="dxa"/>
-          </w:tblCellMar>
-        </w:tblPrEx>
         <w:tc>
           <w:tcPr>
             <w:tcW w:w="900" w:type="dxa"/>
@@ -1194,12 +1140,6 @@
         </w:tc>
       </w:tr>
       <w:tr>
-        <w:tblPrEx>
-          <w:tblCellMar>
-            <w:top w:w="0" w:type="dxa"/>
-            <w:bottom w:w="0" w:type="dxa"/>
-          </w:tblCellMar>
-        </w:tblPrEx>
         <w:tc>
           <w:tcPr>
             <w:tcW w:w="900" w:type="dxa"/>
@@ -1380,12 +1320,6 @@
         </w:tc>
       </w:tr>
       <w:tr>
-        <w:tblPrEx>
-          <w:tblCellMar>
-            <w:top w:w="0" w:type="dxa"/>
-            <w:bottom w:w="0" w:type="dxa"/>
-          </w:tblCellMar>
-        </w:tblPrEx>
         <w:tc>
           <w:tcPr>
             <w:tcW w:w="900" w:type="dxa"/>
@@ -1566,12 +1500,6 @@
         </w:tc>
       </w:tr>
       <w:tr>
-        <w:tblPrEx>
-          <w:tblCellMar>
-            <w:top w:w="0" w:type="dxa"/>
-            <w:bottom w:w="0" w:type="dxa"/>
-          </w:tblCellMar>
-        </w:tblPrEx>
         <w:tc>
           <w:tcPr>
             <w:tcW w:w="900" w:type="dxa"/>
@@ -1752,12 +1680,6 @@
         </w:tc>
       </w:tr>
       <w:tr>
-        <w:tblPrEx>
-          <w:tblCellMar>
-            <w:top w:w="0" w:type="dxa"/>
-            <w:bottom w:w="0" w:type="dxa"/>
-          </w:tblCellMar>
-        </w:tblPrEx>
         <w:tc>
           <w:tcPr>
             <w:tcW w:w="900" w:type="dxa"/>
@@ -2017,12 +1939,6 @@
         <w:gridCol w:w="7560"/>
       </w:tblGrid>
       <w:tr>
-        <w:tblPrEx>
-          <w:tblCellMar>
-            <w:top w:w="0" w:type="dxa"/>
-            <w:bottom w:w="0" w:type="dxa"/>
-          </w:tblCellMar>
-        </w:tblPrEx>
         <w:tc>
           <w:tcPr>
             <w:tcW w:w="1800" w:type="dxa"/>
@@ -2085,12 +2001,6 @@
         </w:tc>
       </w:tr>
       <w:tr>
-        <w:tblPrEx>
-          <w:tblCellMar>
-            <w:top w:w="0" w:type="dxa"/>
-            <w:bottom w:w="0" w:type="dxa"/>
-          </w:tblCellMar>
-        </w:tblPrEx>
         <w:tc>
           <w:tcPr>
             <w:tcW w:w="1800" w:type="dxa"/>
@@ -2150,12 +2060,6 @@
         </w:tc>
       </w:tr>
       <w:tr>
-        <w:tblPrEx>
-          <w:tblCellMar>
-            <w:top w:w="0" w:type="dxa"/>
-            <w:bottom w:w="0" w:type="dxa"/>
-          </w:tblCellMar>
-        </w:tblPrEx>
         <w:tc>
           <w:tcPr>
             <w:tcW w:w="1800" w:type="dxa"/>
@@ -2215,12 +2119,6 @@
         </w:tc>
       </w:tr>
       <w:tr>
-        <w:tblPrEx>
-          <w:tblCellMar>
-            <w:top w:w="0" w:type="dxa"/>
-            <w:bottom w:w="0" w:type="dxa"/>
-          </w:tblCellMar>
-        </w:tblPrEx>
         <w:tc>
           <w:tcPr>
             <w:tcW w:w="1800" w:type="dxa"/>
@@ -2280,12 +2178,6 @@
         </w:tc>
       </w:tr>
       <w:tr>
-        <w:tblPrEx>
-          <w:tblCellMar>
-            <w:top w:w="0" w:type="dxa"/>
-            <w:bottom w:w="0" w:type="dxa"/>
-          </w:tblCellMar>
-        </w:tblPrEx>
         <w:tc>
           <w:tcPr>
             <w:tcW w:w="1800" w:type="dxa"/>
@@ -2345,12 +2237,6 @@
         </w:tc>
       </w:tr>
       <w:tr>
-        <w:tblPrEx>
-          <w:tblCellMar>
-            <w:top w:w="0" w:type="dxa"/>
-            <w:bottom w:w="0" w:type="dxa"/>
-          </w:tblCellMar>
-        </w:tblPrEx>
         <w:tc>
           <w:tcPr>
             <w:tcW w:w="1800" w:type="dxa"/>
@@ -2410,12 +2296,6 @@
         </w:tc>
       </w:tr>
       <w:tr>
-        <w:tblPrEx>
-          <w:tblCellMar>
-            <w:top w:w="0" w:type="dxa"/>
-            <w:bottom w:w="0" w:type="dxa"/>
-          </w:tblCellMar>
-        </w:tblPrEx>
         <w:tc>
           <w:tcPr>
             <w:tcW w:w="1800" w:type="dxa"/>
@@ -2494,12 +2374,6 @@
         </w:tc>
       </w:tr>
       <w:tr>
-        <w:tblPrEx>
-          <w:tblCellMar>
-            <w:top w:w="0" w:type="dxa"/>
-            <w:bottom w:w="0" w:type="dxa"/>
-          </w:tblCellMar>
-        </w:tblPrEx>
         <w:tc>
           <w:tcPr>
             <w:tcW w:w="1800" w:type="dxa"/>
@@ -2588,12 +2462,6 @@
         </w:tc>
       </w:tr>
       <w:tr>
-        <w:tblPrEx>
-          <w:tblCellMar>
-            <w:top w:w="0" w:type="dxa"/>
-            <w:bottom w:w="0" w:type="dxa"/>
-          </w:tblCellMar>
-        </w:tblPrEx>
         <w:tc>
           <w:tcPr>
             <w:tcW w:w="1800" w:type="dxa"/>
@@ -2700,12 +2568,6 @@
         <w:gridCol w:w="7560"/>
       </w:tblGrid>
       <w:tr>
-        <w:tblPrEx>
-          <w:tblCellMar>
-            <w:top w:w="0" w:type="dxa"/>
-            <w:bottom w:w="0" w:type="dxa"/>
-          </w:tblCellMar>
-        </w:tblPrEx>
         <w:tc>
           <w:tcPr>
             <w:tcW w:w="1800" w:type="dxa"/>
@@ -2769,12 +2631,6 @@
         </w:tc>
       </w:tr>
       <w:tr>
-        <w:tblPrEx>
-          <w:tblCellMar>
-            <w:top w:w="0" w:type="dxa"/>
-            <w:bottom w:w="0" w:type="dxa"/>
-          </w:tblCellMar>
-        </w:tblPrEx>
         <w:tc>
           <w:tcPr>
             <w:tcW w:w="1800" w:type="dxa"/>
@@ -2834,12 +2690,6 @@
         </w:tc>
       </w:tr>
       <w:tr>
-        <w:tblPrEx>
-          <w:tblCellMar>
-            <w:top w:w="0" w:type="dxa"/>
-            <w:bottom w:w="0" w:type="dxa"/>
-          </w:tblCellMar>
-        </w:tblPrEx>
         <w:tc>
           <w:tcPr>
             <w:tcW w:w="1800" w:type="dxa"/>
@@ -2899,12 +2749,6 @@
         </w:tc>
       </w:tr>
       <w:tr>
-        <w:tblPrEx>
-          <w:tblCellMar>
-            <w:top w:w="0" w:type="dxa"/>
-            <w:bottom w:w="0" w:type="dxa"/>
-          </w:tblCellMar>
-        </w:tblPrEx>
         <w:tc>
           <w:tcPr>
             <w:tcW w:w="1800" w:type="dxa"/>
@@ -2964,12 +2808,6 @@
         </w:tc>
       </w:tr>
       <w:tr>
-        <w:tblPrEx>
-          <w:tblCellMar>
-            <w:top w:w="0" w:type="dxa"/>
-            <w:bottom w:w="0" w:type="dxa"/>
-          </w:tblCellMar>
-        </w:tblPrEx>
         <w:tc>
           <w:tcPr>
             <w:tcW w:w="1800" w:type="dxa"/>
@@ -3029,12 +2867,6 @@
         </w:tc>
       </w:tr>
       <w:tr>
-        <w:tblPrEx>
-          <w:tblCellMar>
-            <w:top w:w="0" w:type="dxa"/>
-            <w:bottom w:w="0" w:type="dxa"/>
-          </w:tblCellMar>
-        </w:tblPrEx>
         <w:tc>
           <w:tcPr>
             <w:tcW w:w="1800" w:type="dxa"/>
@@ -3094,12 +2926,6 @@
         </w:tc>
       </w:tr>
       <w:tr>
-        <w:tblPrEx>
-          <w:tblCellMar>
-            <w:top w:w="0" w:type="dxa"/>
-            <w:bottom w:w="0" w:type="dxa"/>
-          </w:tblCellMar>
-        </w:tblPrEx>
         <w:tc>
           <w:tcPr>
             <w:tcW w:w="1800" w:type="dxa"/>
@@ -3160,12 +2986,6 @@
         </w:tc>
       </w:tr>
       <w:tr>
-        <w:tblPrEx>
-          <w:tblCellMar>
-            <w:top w:w="0" w:type="dxa"/>
-            <w:bottom w:w="0" w:type="dxa"/>
-          </w:tblCellMar>
-        </w:tblPrEx>
         <w:tc>
           <w:tcPr>
             <w:tcW w:w="1800" w:type="dxa"/>
@@ -3238,12 +3058,6 @@
         </w:tc>
       </w:tr>
       <w:tr>
-        <w:tblPrEx>
-          <w:tblCellMar>
-            <w:top w:w="0" w:type="dxa"/>
-            <w:bottom w:w="0" w:type="dxa"/>
-          </w:tblCellMar>
-        </w:tblPrEx>
         <w:tc>
           <w:tcPr>
             <w:tcW w:w="1800" w:type="dxa"/>
@@ -3350,12 +3164,6 @@
         <w:gridCol w:w="7560"/>
       </w:tblGrid>
       <w:tr>
-        <w:tblPrEx>
-          <w:tblCellMar>
-            <w:top w:w="0" w:type="dxa"/>
-            <w:bottom w:w="0" w:type="dxa"/>
-          </w:tblCellMar>
-        </w:tblPrEx>
         <w:tc>
           <w:tcPr>
             <w:tcW w:w="1800" w:type="dxa"/>
@@ -3418,12 +3226,6 @@
         </w:tc>
       </w:tr>
       <w:tr>
-        <w:tblPrEx>
-          <w:tblCellMar>
-            <w:top w:w="0" w:type="dxa"/>
-            <w:bottom w:w="0" w:type="dxa"/>
-          </w:tblCellMar>
-        </w:tblPrEx>
         <w:tc>
           <w:tcPr>
             <w:tcW w:w="1800" w:type="dxa"/>
@@ -3483,12 +3285,6 @@
         </w:tc>
       </w:tr>
       <w:tr>
-        <w:tblPrEx>
-          <w:tblCellMar>
-            <w:top w:w="0" w:type="dxa"/>
-            <w:bottom w:w="0" w:type="dxa"/>
-          </w:tblCellMar>
-        </w:tblPrEx>
         <w:tc>
           <w:tcPr>
             <w:tcW w:w="1800" w:type="dxa"/>
@@ -3548,12 +3344,6 @@
         </w:tc>
       </w:tr>
       <w:tr>
-        <w:tblPrEx>
-          <w:tblCellMar>
-            <w:top w:w="0" w:type="dxa"/>
-            <w:bottom w:w="0" w:type="dxa"/>
-          </w:tblCellMar>
-        </w:tblPrEx>
         <w:tc>
           <w:tcPr>
             <w:tcW w:w="1800" w:type="dxa"/>
@@ -3613,12 +3403,6 @@
         </w:tc>
       </w:tr>
       <w:tr>
-        <w:tblPrEx>
-          <w:tblCellMar>
-            <w:top w:w="0" w:type="dxa"/>
-            <w:bottom w:w="0" w:type="dxa"/>
-          </w:tblCellMar>
-        </w:tblPrEx>
         <w:tc>
           <w:tcPr>
             <w:tcW w:w="1800" w:type="dxa"/>
@@ -3678,12 +3462,6 @@
         </w:tc>
       </w:tr>
       <w:tr>
-        <w:tblPrEx>
-          <w:tblCellMar>
-            <w:top w:w="0" w:type="dxa"/>
-            <w:bottom w:w="0" w:type="dxa"/>
-          </w:tblCellMar>
-        </w:tblPrEx>
         <w:tc>
           <w:tcPr>
             <w:tcW w:w="1800" w:type="dxa"/>
@@ -3761,12 +3539,6 @@
         </w:tc>
       </w:tr>
       <w:tr>
-        <w:tblPrEx>
-          <w:tblCellMar>
-            <w:top w:w="0" w:type="dxa"/>
-            <w:bottom w:w="0" w:type="dxa"/>
-          </w:tblCellMar>
-        </w:tblPrEx>
         <w:tc>
           <w:tcPr>
             <w:tcW w:w="1800" w:type="dxa"/>
@@ -3827,12 +3599,6 @@
         </w:tc>
       </w:tr>
       <w:tr>
-        <w:tblPrEx>
-          <w:tblCellMar>
-            <w:top w:w="0" w:type="dxa"/>
-            <w:bottom w:w="0" w:type="dxa"/>
-          </w:tblCellMar>
-        </w:tblPrEx>
         <w:tc>
           <w:tcPr>
             <w:tcW w:w="1800" w:type="dxa"/>
@@ -3923,12 +3689,6 @@
         </w:tc>
       </w:tr>
       <w:tr>
-        <w:tblPrEx>
-          <w:tblCellMar>
-            <w:top w:w="0" w:type="dxa"/>
-            <w:bottom w:w="0" w:type="dxa"/>
-          </w:tblCellMar>
-        </w:tblPrEx>
         <w:tc>
           <w:tcPr>
             <w:tcW w:w="1800" w:type="dxa"/>
@@ -4035,12 +3795,6 @@
         <w:gridCol w:w="7560"/>
       </w:tblGrid>
       <w:tr>
-        <w:tblPrEx>
-          <w:tblCellMar>
-            <w:top w:w="0" w:type="dxa"/>
-            <w:bottom w:w="0" w:type="dxa"/>
-          </w:tblCellMar>
-        </w:tblPrEx>
         <w:tc>
           <w:tcPr>
             <w:tcW w:w="1800" w:type="dxa"/>
@@ -4080,35 +3834,34 @@
               <w:bottom w:val="single" w:sz="1" w:space="0" w:color="D0D8EC"/>
               <w:right w:val="single" w:sz="1" w:space="0" w:color="D0D8EC"/>
             </w:tcBorders>
-            <w:shd w:val="clear" w:color="auto" w:fill="FDF6E3"/>
-            <w:tcMar>
-              <w:top w:w="80" w:type="dxa"/>
-              <w:left w:w="120" w:type="dxa"/>
-              <w:bottom w:w="80" w:type="dxa"/>
-              <w:right w:w="120" w:type="dxa"/>
-            </w:tcMar>
-          </w:tcPr>
-          <w:p>
-            <w:r>
-              <w:rPr>
-                <w:b/>
-                <w:bCs/>
-                <w:color w:val="7A5C00"/>
-                <w:sz w:val="18"/>
-                <w:szCs w:val="18"/>
-              </w:rPr>
-              <w:t>PENDING</w:t>
+            <w:shd w:val="clear" w:color="auto" w:fill="F0FDF4"/>
+            <w:tcMar>
+              <w:top w:w="80" w:type="dxa"/>
+              <w:left w:w="120" w:type="dxa"/>
+              <w:bottom w:w="80" w:type="dxa"/>
+              <w:right w:w="120" w:type="dxa"/>
+            </w:tcMar>
+          </w:tcPr>
+          <w:p>
+            <w:pPr>
+              <w:rPr>
+                <w:color w:val="166534"/>
+              </w:rPr>
+            </w:pPr>
+            <w:r>
+              <w:rPr>
+                <w:b/>
+                <w:bCs/>
+                <w:color w:val="166534"/>
+                <w:sz w:val="18"/>
+                <w:szCs w:val="18"/>
+              </w:rPr>
+              <w:t>DECIDED — 01 June 2026</w:t>
             </w:r>
           </w:p>
         </w:tc>
       </w:tr>
       <w:tr>
-        <w:tblPrEx>
-          <w:tblCellMar>
-            <w:top w:w="0" w:type="dxa"/>
-            <w:bottom w:w="0" w:type="dxa"/>
-          </w:tblCellMar>
-        </w:tblPrEx>
         <w:tc>
           <w:tcPr>
             <w:tcW w:w="1800" w:type="dxa"/>
@@ -4162,18 +3915,12 @@
                 <w:sz w:val="18"/>
                 <w:szCs w:val="18"/>
               </w:rPr>
-              <w:t>Step 9 — Physical Database Design</w:t>
+              <w:t>Step 6 — Risk Analysis and ADR Resolution</w:t>
             </w:r>
           </w:p>
         </w:tc>
       </w:tr>
       <w:tr>
-        <w:tblPrEx>
-          <w:tblCellMar>
-            <w:top w:w="0" w:type="dxa"/>
-            <w:bottom w:w="0" w:type="dxa"/>
-          </w:tblCellMar>
-        </w:tblPrEx>
         <w:tc>
           <w:tcPr>
             <w:tcW w:w="1800" w:type="dxa"/>
@@ -4221,24 +3968,41 @@
             </w:tcMar>
           </w:tcPr>
           <w:p>
-            <w:r>
+            <w:pPr>
               <w:rPr>
                 <w:color w:val="1A1A1A"/>
                 <w:sz w:val="18"/>
                 <w:szCs w:val="18"/>
               </w:rPr>
-              <w:t>Design philosophy agreed — project inception</w:t>
+            </w:pPr>
+            <w:r>
+              <w:rPr>
+                <w:color w:val="1A1A1A"/>
+                <w:sz w:val="18"/>
+                <w:szCs w:val="18"/>
+              </w:rPr>
+              <w:t>10 multi-source systems requiring</w:t>
+            </w:r>
+            <w:r>
+              <w:rPr>
+                <w:color w:val="1A1A1A"/>
+                <w:sz w:val="18"/>
+                <w:szCs w:val="18"/>
+              </w:rPr>
+              <w:t xml:space="preserve"> </w:t>
+            </w:r>
+            <w:r>
+              <w:rPr>
+                <w:color w:val="1A1A1A"/>
+                <w:sz w:val="18"/>
+                <w:szCs w:val="18"/>
+              </w:rPr>
+              <w:t>unified architecture across all domains.</w:t>
             </w:r>
           </w:p>
         </w:tc>
       </w:tr>
       <w:tr>
-        <w:tblPrEx>
-          <w:tblCellMar>
-            <w:top w:w="0" w:type="dxa"/>
-            <w:bottom w:w="0" w:type="dxa"/>
-          </w:tblCellMar>
-        </w:tblPrEx>
         <w:tc>
           <w:tcPr>
             <w:tcW w:w="1800" w:type="dxa"/>
@@ -4298,12 +4062,6 @@
         </w:tc>
       </w:tr>
       <w:tr>
-        <w:tblPrEx>
-          <w:tblCellMar>
-            <w:top w:w="0" w:type="dxa"/>
-            <w:bottom w:w="0" w:type="dxa"/>
-          </w:tblCellMar>
-        </w:tblPrEx>
         <w:tc>
           <w:tcPr>
             <w:tcW w:w="1800" w:type="dxa"/>
@@ -4358,18 +4116,12 @@
                 <w:sz w:val="18"/>
                 <w:szCs w:val="18"/>
               </w:rPr>
-              <w:t>Step 9 completion</w:t>
+              <w:t>RESOLVED — Step 6</w:t>
             </w:r>
           </w:p>
         </w:tc>
       </w:tr>
       <w:tr>
-        <w:tblPrEx>
-          <w:tblCellMar>
-            <w:top w:w="0" w:type="dxa"/>
-            <w:bottom w:w="0" w:type="dxa"/>
-          </w:tblCellMar>
-        </w:tblPrEx>
         <w:tc>
           <w:tcPr>
             <w:tcW w:w="1800" w:type="dxa"/>
@@ -4423,18 +4175,46 @@
                 <w:sz w:val="18"/>
                 <w:szCs w:val="18"/>
               </w:rPr>
-              <w:t>RetailSphere data platform will use a medallion architecture (Bronze, Silver, Gold) on a cloud-native platform. The boundaries between layers — what transforms at each layer, what governance applies, what latency is acceptable — must be formally defined before physical database design begins.</w:t>
+              <w:t xml:space="preserve">We have about 10 multi-source </w:t>
+            </w:r>
+            <w:r>
+              <w:rPr>
+                <w:color w:val="1A1A1A"/>
+                <w:sz w:val="18"/>
+                <w:szCs w:val="18"/>
+              </w:rPr>
+              <w:t>systems (</w:t>
+            </w:r>
+            <w:r>
+              <w:rPr>
+                <w:color w:val="1A1A1A"/>
+                <w:sz w:val="18"/>
+                <w:szCs w:val="18"/>
+              </w:rPr>
+              <w:t xml:space="preserve">different types of data structures) from which we are extracting data. Audit trail requirement, allowing us to reprocess from the </w:t>
+            </w:r>
+            <w:proofErr w:type="gramStart"/>
+            <w:r>
+              <w:rPr>
+                <w:color w:val="1A1A1A"/>
+                <w:sz w:val="18"/>
+                <w:szCs w:val="18"/>
+              </w:rPr>
+              <w:t>Bronze</w:t>
+            </w:r>
+            <w:proofErr w:type="gramEnd"/>
+            <w:r>
+              <w:rPr>
+                <w:color w:val="1A1A1A"/>
+                <w:sz w:val="18"/>
+                <w:szCs w:val="18"/>
+              </w:rPr>
+              <w:t xml:space="preserve"> layer, as there will be no need to re-extract from the sources, and only the changed data is being processed, which will save us time in case of failure and the need to reprocess the pipeline. Each layer processes only what has changed since the last run. Bronze captures raw changes. Silver transforms only new records. The Gold layer refreshes only affected aggregates.</w:t>
             </w:r>
           </w:p>
         </w:tc>
       </w:tr>
       <w:tr>
-        <w:tblPrEx>
-          <w:tblCellMar>
-            <w:top w:w="0" w:type="dxa"/>
-            <w:bottom w:w="0" w:type="dxa"/>
-          </w:tblCellMar>
-        </w:tblPrEx>
         <w:tc>
           <w:tcPr>
             <w:tcW w:w="1800" w:type="dxa"/>
@@ -4474,69 +4254,36 @@
               <w:bottom w:val="single" w:sz="1" w:space="0" w:color="D0D8EC"/>
               <w:right w:val="single" w:sz="1" w:space="0" w:color="D0D8EC"/>
             </w:tcBorders>
-            <w:shd w:val="clear" w:color="auto" w:fill="FDF6E3"/>
-            <w:tcMar>
-              <w:top w:w="80" w:type="dxa"/>
-              <w:left w:w="120" w:type="dxa"/>
-              <w:bottom w:w="80" w:type="dxa"/>
-              <w:right w:w="120" w:type="dxa"/>
-            </w:tcMar>
-          </w:tcPr>
-          <w:p>
+            <w:shd w:val="clear" w:color="auto" w:fill="F0FDF4"/>
+            <w:tcMar>
+              <w:top w:w="80" w:type="dxa"/>
+              <w:left w:w="120" w:type="dxa"/>
+              <w:bottom w:w="80" w:type="dxa"/>
+              <w:right w:w="120" w:type="dxa"/>
+            </w:tcMar>
+          </w:tcPr>
+          <w:p>
+            <w:r>
+              <w:rPr>
+                <w:color w:val="166534"/>
+                <w:sz w:val="18"/>
+                <w:szCs w:val="18"/>
+                <w:shd w:val="clear" w:color="auto" w:fill="F0FDF4"/>
+              </w:rPr>
+              <w:t>DECIDED — Medallion Architecture chosen. Bronze → Silver → Gold. Reasons: Audit trail (Johan), data governance and POPIA (Priya), 10 multi-source support, incremental load requirements</w:t>
+            </w:r>
             <w:r>
               <w:rPr>
                 <w:color w:val="7A5C00"/>
                 <w:sz w:val="18"/>
                 <w:szCs w:val="18"/>
               </w:rPr>
-              <w:t xml:space="preserve">PENDING — To be defined in Step 9. Preliminary design: Bronze = raw ingestion with source system provenance columns and event/processing timestamp separation. Silver = cleansed, standardised, conformed. Gold = dimensional model (Kimball star schema) serving business domains. </w:t>
-            </w:r>
-            <w:proofErr w:type="spellStart"/>
-            <w:r>
-              <w:rPr>
-                <w:color w:val="7A5C00"/>
-                <w:sz w:val="18"/>
-                <w:szCs w:val="18"/>
-              </w:rPr>
-              <w:t>dbt</w:t>
-            </w:r>
-            <w:proofErr w:type="spellEnd"/>
-            <w:r>
-              <w:rPr>
-                <w:color w:val="7A5C00"/>
-                <w:sz w:val="18"/>
-                <w:szCs w:val="18"/>
-              </w:rPr>
-              <w:t xml:space="preserve"> handles Silver-to-</w:t>
-            </w:r>
-            <w:proofErr w:type="gramStart"/>
-            <w:r>
-              <w:rPr>
-                <w:color w:val="7A5C00"/>
-                <w:sz w:val="18"/>
-                <w:szCs w:val="18"/>
-              </w:rPr>
-              <w:t>Gold</w:t>
-            </w:r>
-            <w:proofErr w:type="gramEnd"/>
-            <w:r>
-              <w:rPr>
-                <w:color w:val="7A5C00"/>
-                <w:sz w:val="18"/>
-                <w:szCs w:val="18"/>
-              </w:rPr>
-              <w:t xml:space="preserve"> transformations.</w:t>
+              <w:t>.</w:t>
             </w:r>
           </w:p>
         </w:tc>
       </w:tr>
       <w:tr>
-        <w:tblPrEx>
-          <w:tblCellMar>
-            <w:top w:w="0" w:type="dxa"/>
-            <w:bottom w:w="0" w:type="dxa"/>
-          </w:tblCellMar>
-        </w:tblPrEx>
         <w:tc>
           <w:tcPr>
             <w:tcW w:w="1800" w:type="dxa"/>
@@ -4588,33 +4335,31 @@
               <w:bottom w:val="single" w:sz="1" w:space="0" w:color="D0D8EC"/>
               <w:right w:val="single" w:sz="1" w:space="0" w:color="D0D8EC"/>
             </w:tcBorders>
-            <w:shd w:val="clear" w:color="auto" w:fill="FDF0F0"/>
-            <w:tcMar>
-              <w:top w:w="80" w:type="dxa"/>
-              <w:left w:w="120" w:type="dxa"/>
-              <w:bottom w:w="80" w:type="dxa"/>
-              <w:right w:w="120" w:type="dxa"/>
-            </w:tcMar>
-          </w:tcPr>
-          <w:p>
-            <w:r>
-              <w:rPr>
-                <w:color w:val="8B1A1A"/>
-                <w:sz w:val="18"/>
-                <w:szCs w:val="18"/>
-              </w:rPr>
-              <w:t>Layer boundary definition affects ETL design (Step 10), data quality framework (Step 9), and all downstream dimensional model decisions (Step 7).</w:t>
+            <w:tcMar>
+              <w:top w:w="80" w:type="dxa"/>
+              <w:left w:w="120" w:type="dxa"/>
+              <w:bottom w:w="80" w:type="dxa"/>
+              <w:right w:w="120" w:type="dxa"/>
+            </w:tcMar>
+          </w:tcPr>
+          <w:p>
+            <w:pPr>
+              <w:rPr>
+                <w:color w:val="1A1A1A"/>
+              </w:rPr>
+            </w:pPr>
+            <w:r>
+              <w:rPr>
+                <w:color w:val="1A1A1A"/>
+                <w:sz w:val="18"/>
+                <w:szCs w:val="18"/>
+              </w:rPr>
+              <w:t>N/A — Decision made.</w:t>
             </w:r>
           </w:p>
         </w:tc>
       </w:tr>
       <w:tr>
-        <w:tblPrEx>
-          <w:tblCellMar>
-            <w:top w:w="0" w:type="dxa"/>
-            <w:bottom w:w="0" w:type="dxa"/>
-          </w:tblCellMar>
-        </w:tblPrEx>
         <w:tc>
           <w:tcPr>
             <w:tcW w:w="1800" w:type="dxa"/>
@@ -4670,7 +4415,7 @@
                 <w:sz w:val="18"/>
                 <w:szCs w:val="18"/>
               </w:rPr>
-              <w:t>Non-functional requirements (Step 4). Source system investigation (Step 5). Physical platform selection.</w:t>
+              <w:t>All downstream steps — Steps 7-18 depend on this decision being locked.</w:t>
             </w:r>
           </w:p>
         </w:tc>
@@ -4721,12 +4466,6 @@
         <w:gridCol w:w="7560"/>
       </w:tblGrid>
       <w:tr>
-        <w:tblPrEx>
-          <w:tblCellMar>
-            <w:top w:w="0" w:type="dxa"/>
-            <w:bottom w:w="0" w:type="dxa"/>
-          </w:tblCellMar>
-        </w:tblPrEx>
         <w:tc>
           <w:tcPr>
             <w:tcW w:w="1800" w:type="dxa"/>
@@ -4789,12 +4528,6 @@
         </w:tc>
       </w:tr>
       <w:tr>
-        <w:tblPrEx>
-          <w:tblCellMar>
-            <w:top w:w="0" w:type="dxa"/>
-            <w:bottom w:w="0" w:type="dxa"/>
-          </w:tblCellMar>
-        </w:tblPrEx>
         <w:tc>
           <w:tcPr>
             <w:tcW w:w="1800" w:type="dxa"/>
@@ -4854,12 +4587,6 @@
         </w:tc>
       </w:tr>
       <w:tr>
-        <w:tblPrEx>
-          <w:tblCellMar>
-            <w:top w:w="0" w:type="dxa"/>
-            <w:bottom w:w="0" w:type="dxa"/>
-          </w:tblCellMar>
-        </w:tblPrEx>
         <w:tc>
           <w:tcPr>
             <w:tcW w:w="1800" w:type="dxa"/>
@@ -4919,12 +4646,6 @@
         </w:tc>
       </w:tr>
       <w:tr>
-        <w:tblPrEx>
-          <w:tblCellMar>
-            <w:top w:w="0" w:type="dxa"/>
-            <w:bottom w:w="0" w:type="dxa"/>
-          </w:tblCellMar>
-        </w:tblPrEx>
         <w:tc>
           <w:tcPr>
             <w:tcW w:w="1800" w:type="dxa"/>
@@ -4984,12 +4705,6 @@
         </w:tc>
       </w:tr>
       <w:tr>
-        <w:tblPrEx>
-          <w:tblCellMar>
-            <w:top w:w="0" w:type="dxa"/>
-            <w:bottom w:w="0" w:type="dxa"/>
-          </w:tblCellMar>
-        </w:tblPrEx>
         <w:tc>
           <w:tcPr>
             <w:tcW w:w="1800" w:type="dxa"/>
@@ -5049,12 +4764,6 @@
         </w:tc>
       </w:tr>
       <w:tr>
-        <w:tblPrEx>
-          <w:tblCellMar>
-            <w:top w:w="0" w:type="dxa"/>
-            <w:bottom w:w="0" w:type="dxa"/>
-          </w:tblCellMar>
-        </w:tblPrEx>
         <w:tc>
           <w:tcPr>
             <w:tcW w:w="1800" w:type="dxa"/>
@@ -5132,12 +4841,6 @@
         </w:tc>
       </w:tr>
       <w:tr>
-        <w:tblPrEx>
-          <w:tblCellMar>
-            <w:top w:w="0" w:type="dxa"/>
-            <w:bottom w:w="0" w:type="dxa"/>
-          </w:tblCellMar>
-        </w:tblPrEx>
         <w:tc>
           <w:tcPr>
             <w:tcW w:w="1800" w:type="dxa"/>
@@ -5216,12 +4919,6 @@
         </w:tc>
       </w:tr>
       <w:tr>
-        <w:tblPrEx>
-          <w:tblCellMar>
-            <w:top w:w="0" w:type="dxa"/>
-            <w:bottom w:w="0" w:type="dxa"/>
-          </w:tblCellMar>
-        </w:tblPrEx>
         <w:tc>
           <w:tcPr>
             <w:tcW w:w="1800" w:type="dxa"/>
@@ -5294,12 +4991,6 @@
         </w:tc>
       </w:tr>
       <w:tr>
-        <w:tblPrEx>
-          <w:tblCellMar>
-            <w:top w:w="0" w:type="dxa"/>
-            <w:bottom w:w="0" w:type="dxa"/>
-          </w:tblCellMar>
-        </w:tblPrEx>
         <w:tc>
           <w:tcPr>
             <w:tcW w:w="1800" w:type="dxa"/>
@@ -5428,12 +5119,6 @@
         <w:gridCol w:w="7560"/>
       </w:tblGrid>
       <w:tr>
-        <w:tblPrEx>
-          <w:tblCellMar>
-            <w:top w:w="0" w:type="dxa"/>
-            <w:bottom w:w="0" w:type="dxa"/>
-          </w:tblCellMar>
-        </w:tblPrEx>
         <w:tc>
           <w:tcPr>
             <w:tcW w:w="1800" w:type="dxa"/>
@@ -5496,12 +5181,6 @@
         </w:tc>
       </w:tr>
       <w:tr>
-        <w:tblPrEx>
-          <w:tblCellMar>
-            <w:top w:w="0" w:type="dxa"/>
-            <w:bottom w:w="0" w:type="dxa"/>
-          </w:tblCellMar>
-        </w:tblPrEx>
         <w:tc>
           <w:tcPr>
             <w:tcW w:w="1800" w:type="dxa"/>
@@ -5561,12 +5240,6 @@
         </w:tc>
       </w:tr>
       <w:tr>
-        <w:tblPrEx>
-          <w:tblCellMar>
-            <w:top w:w="0" w:type="dxa"/>
-            <w:bottom w:w="0" w:type="dxa"/>
-          </w:tblCellMar>
-        </w:tblPrEx>
         <w:tc>
           <w:tcPr>
             <w:tcW w:w="1800" w:type="dxa"/>
@@ -5626,12 +5299,6 @@
         </w:tc>
       </w:tr>
       <w:tr>
-        <w:tblPrEx>
-          <w:tblCellMar>
-            <w:top w:w="0" w:type="dxa"/>
-            <w:bottom w:w="0" w:type="dxa"/>
-          </w:tblCellMar>
-        </w:tblPrEx>
         <w:tc>
           <w:tcPr>
             <w:tcW w:w="1800" w:type="dxa"/>
@@ -5691,12 +5358,6 @@
         </w:tc>
       </w:tr>
       <w:tr>
-        <w:tblPrEx>
-          <w:tblCellMar>
-            <w:top w:w="0" w:type="dxa"/>
-            <w:bottom w:w="0" w:type="dxa"/>
-          </w:tblCellMar>
-        </w:tblPrEx>
         <w:tc>
           <w:tcPr>
             <w:tcW w:w="1800" w:type="dxa"/>
@@ -5756,12 +5417,6 @@
         </w:tc>
       </w:tr>
       <w:tr>
-        <w:tblPrEx>
-          <w:tblCellMar>
-            <w:top w:w="0" w:type="dxa"/>
-            <w:bottom w:w="0" w:type="dxa"/>
-          </w:tblCellMar>
-        </w:tblPrEx>
         <w:tc>
           <w:tcPr>
             <w:tcW w:w="1800" w:type="dxa"/>
@@ -5821,12 +5476,6 @@
         </w:tc>
       </w:tr>
       <w:tr>
-        <w:tblPrEx>
-          <w:tblCellMar>
-            <w:top w:w="0" w:type="dxa"/>
-            <w:bottom w:w="0" w:type="dxa"/>
-          </w:tblCellMar>
-        </w:tblPrEx>
         <w:tc>
           <w:tcPr>
             <w:tcW w:w="1800" w:type="dxa"/>
@@ -5896,12 +5545,6 @@
         </w:tc>
       </w:tr>
       <w:tr>
-        <w:tblPrEx>
-          <w:tblCellMar>
-            <w:top w:w="0" w:type="dxa"/>
-            <w:bottom w:w="0" w:type="dxa"/>
-          </w:tblCellMar>
-        </w:tblPrEx>
         <w:tc>
           <w:tcPr>
             <w:tcW w:w="1800" w:type="dxa"/>
@@ -5975,12 +5618,6 @@
         </w:tc>
       </w:tr>
       <w:tr>
-        <w:tblPrEx>
-          <w:tblCellMar>
-            <w:top w:w="0" w:type="dxa"/>
-            <w:bottom w:w="0" w:type="dxa"/>
-          </w:tblCellMar>
-        </w:tblPrEx>
         <w:tc>
           <w:tcPr>
             <w:tcW w:w="1800" w:type="dxa"/>
@@ -6127,12 +5764,6 @@
       <w:gridCol w:w="4360"/>
     </w:tblGrid>
     <w:tr>
-      <w:tblPrEx>
-        <w:tblCellMar>
-          <w:top w:w="0" w:type="dxa"/>
-          <w:bottom w:w="0" w:type="dxa"/>
-        </w:tblCellMar>
-      </w:tblPrEx>
       <w:tc>
         <w:tcPr>
           <w:tcW w:w="5000" w:type="dxa"/>
@@ -6313,12 +5944,6 @@
       <w:gridCol w:w="3360"/>
     </w:tblGrid>
     <w:tr>
-      <w:tblPrEx>
-        <w:tblCellMar>
-          <w:top w:w="0" w:type="dxa"/>
-          <w:bottom w:w="0" w:type="dxa"/>
-        </w:tblCellMar>
-      </w:tblPrEx>
       <w:tc>
         <w:tcPr>
           <w:tcW w:w="6000" w:type="dxa"/>
@@ -6356,23 +5981,21 @@
           <w:pPr>
             <w:jc w:val="right"/>
           </w:pPr>
-          <w:proofErr w:type="gramStart"/>
           <w:r>
             <w:rPr>
               <w:color w:val="555555"/>
               <w:sz w:val="16"/>
               <w:szCs w:val="16"/>
             </w:rPr>
-            <w:t>CONFIDENTIAL  |</w:t>
+            <w:t>CONFIDENTIAL | v</w:t>
           </w:r>
-          <w:proofErr w:type="gramEnd"/>
           <w:r>
             <w:rPr>
               <w:color w:val="555555"/>
               <w:sz w:val="16"/>
               <w:szCs w:val="16"/>
             </w:rPr>
-            <w:t xml:space="preserve">  v1.0</w:t>
+            <w:t>1.0</w:t>
           </w:r>
         </w:p>
       </w:tc>
@@ -6958,7 +6581,6 @@
   <w:style w:type="character" w:default="1" w:styleId="DefaultParagraphFont">
     <w:name w:val="Default Paragraph Font"/>
     <w:uiPriority w:val="1"/>
-    <w:semiHidden/>
     <w:unhideWhenUsed/>
   </w:style>
   <w:style w:type="table" w:default="1" w:styleId="TableNormal">
@@ -7065,6 +6687,48 @@
       <w:sz w:val="20"/>
       <w:szCs w:val="20"/>
     </w:rPr>
+  </w:style>
+  <w:style w:type="paragraph" w:styleId="Header">
+    <w:name w:val="header"/>
+    <w:basedOn w:val="Normal"/>
+    <w:link w:val="HeaderChar"/>
+    <w:uiPriority w:val="99"/>
+    <w:unhideWhenUsed/>
+    <w:rsid w:val="00011348"/>
+    <w:pPr>
+      <w:tabs>
+        <w:tab w:val="center" w:pos="4513"/>
+        <w:tab w:val="right" w:pos="9026"/>
+      </w:tabs>
+    </w:pPr>
+  </w:style>
+  <w:style w:type="character" w:customStyle="1" w:styleId="HeaderChar">
+    <w:name w:val="Header Char"/>
+    <w:basedOn w:val="DefaultParagraphFont"/>
+    <w:link w:val="Header"/>
+    <w:uiPriority w:val="99"/>
+    <w:rsid w:val="00011348"/>
+  </w:style>
+  <w:style w:type="paragraph" w:styleId="Footer">
+    <w:name w:val="footer"/>
+    <w:basedOn w:val="Normal"/>
+    <w:link w:val="FooterChar"/>
+    <w:uiPriority w:val="99"/>
+    <w:unhideWhenUsed/>
+    <w:rsid w:val="00011348"/>
+    <w:pPr>
+      <w:tabs>
+        <w:tab w:val="center" w:pos="4513"/>
+        <w:tab w:val="right" w:pos="9026"/>
+      </w:tabs>
+    </w:pPr>
+  </w:style>
+  <w:style w:type="character" w:customStyle="1" w:styleId="FooterChar">
+    <w:name w:val="Footer Char"/>
+    <w:basedOn w:val="DefaultParagraphFont"/>
+    <w:link w:val="Footer"/>
+    <w:uiPriority w:val="99"/>
+    <w:rsid w:val="00011348"/>
   </w:style>
 </w:styles>
 </file>

</xml_diff>